<commit_message>
Update address and email in Impressum and Datenschutz
</commit_message>
<xml_diff>
--- a/AVA_Dienstleistungsvertrag.docx
+++ b/AVA_Dienstleistungsvertrag.docx
@@ -171,7 +171,7 @@
                 <w:sz w:val="20"/>
                 <w:szCs w:val="20"/>
               </w:rPr>
-              <w:t xml:space="preserve">Karl-von-Hahn-Str. 25, 72250 Freudenstadt</w:t>
+              <w:t xml:space="preserve">Herzog-Eugen-Str. 56/58, 72250 Freudenstadt</w:t>
             </w:r>
           </w:p>
           <w:p>
@@ -213,7 +213,7 @@
                 <w:sz w:val="20"/>
                 <w:szCs w:val="20"/>
               </w:rPr>
-              <w:t xml:space="preserve">E-Mail: dankiazad@gmail.com</w:t>
+              <w:t xml:space="preserve">E-Mail: contact@ava-hq.com</w:t>
             </w:r>
           </w:p>
         </w:tc>
@@ -4500,7 +4500,7 @@
         <w:sz w:val="17"/>
         <w:szCs w:val="17"/>
       </w:rPr>
-      <w:t xml:space="preserve">AVA AI  ·  ava-hq.com  ·  dankiazad@gmail.com</w:t>
+      <w:t xml:space="preserve">AVA AI  ·  ava-hq.com  ·  contact@ava-hq.com</w:t>
     </w:r>
     <w:r>
       <w:rPr>

</xml_diff>